<commit_message>
court(sc): amicus brief gated on the shared model, latex and docx regenerated
The serial lane's URL breaks settle footnote 6; the authorities' group headings are in
capitals again (authorities.group.upper, as filed); the conclusion's last paragraph
stays with the signature.

(fb-595.54.49)

Co-Authored-By: Claude Opus 5.5 <noreply@anthropic.com>
</commit_message>
<xml_diff>
--- a/courts/fourth-circuit/south-carolina/state/supreme-court/amicus-brief/usage/OUTPUT-amicus-brief.docx
+++ b/courts/fourth-circuit/south-carolina/state/supreme-court/amicus-brief/usage/OUTPUT-amicus-brief.docx
@@ -1740,7 +1740,7 @@
           <w:b/>
           <w:bCs/>
         </w:rPr>
-        <w:t xml:space="preserve">Cases</w:t>
+        <w:t xml:space="preserve">CASES</w:t>
       </w:r>
     </w:p>
     <w:p>
@@ -2449,7 +2449,7 @@
         <w:t xml:space="preserve">S.E.2d</w:t>
       </w:r>
       <w:r>
-        <w:t xml:space="preserve"> </w:t>
+        <w:t xml:space="preserve"> </w:t>
       </w:r>
       <w:r>
         <w:t xml:space="preserve">,</w:t>
@@ -3051,7 +3051,7 @@
         <w:t xml:space="preserve">S.E.2d</w:t>
       </w:r>
       <w:r>
-        <w:t xml:space="preserve"> </w:t>
+        <w:t xml:space="preserve"> </w:t>
       </w:r>
       <w:r>
         <w:t xml:space="preserve">,</w:t>
@@ -4462,7 +4462,7 @@
           <w:b/>
           <w:bCs/>
         </w:rPr>
-        <w:t xml:space="preserve">Statutes</w:t>
+        <w:t xml:space="preserve">STATUTES</w:t>
       </w:r>
     </w:p>
     <w:p>
@@ -4678,7 +4678,7 @@
           <w:b/>
           <w:bCs/>
         </w:rPr>
-        <w:t xml:space="preserve">Regulations</w:t>
+        <w:t xml:space="preserve">REGULATIONS</w:t>
       </w:r>
     </w:p>
     <w:p>
@@ -4748,21 +4748,21 @@
           <w:b/>
           <w:bCs/>
         </w:rPr>
-        <w:t xml:space="preserve">Other</w:t>
-      </w:r>
-      <w:r>
-        <w:rPr>
-          <w:b/>
-          <w:bCs/>
-        </w:rPr>
-        <w:t xml:space="preserve"> </w:t>
-      </w:r>
-      <w:r>
-        <w:rPr>
-          <w:b/>
-          <w:bCs/>
-        </w:rPr>
-        <w:t xml:space="preserve">Authorities</w:t>
+        <w:t xml:space="preserve">OTHER</w:t>
+      </w:r>
+      <w:r>
+        <w:rPr>
+          <w:b/>
+          <w:bCs/>
+        </w:rPr>
+        <w:t xml:space="preserve"> </w:t>
+      </w:r>
+      <w:r>
+        <w:rPr>
+          <w:b/>
+          <w:bCs/>
+        </w:rPr>
+        <w:t xml:space="preserve">AUTHORITIES</w:t>
       </w:r>
     </w:p>
     <w:p>
@@ -5877,7 +5877,7 @@
         <w:tab/>
       </w:r>
       <w:r>
-        <w:t xml:space="preserve">8</w:t>
+        <w:t xml:space="preserve">9</w:t>
       </w:r>
     </w:p>
     <w:p>
@@ -7028,7 +7028,7 @@
         <w:t xml:space="preserve"> </w:t>
       </w:r>
       <w:r>
-        <w:t xml:space="preserve">v. Fisher Controls Int’l, LLC, S.E.2d , 2024 WL 3882708, at *11 (Aug. 21, 2024) (Kittredge, C.J., dissenting) (discussing Smith v. Tiffany).</w:t>
+        <w:t xml:space="preserve">v. Fisher Controls Int’l, LLC, S.E.2d , 2024 WL 3882708, at *11 (Aug. 21, 2024) (Kittredge, C.J., dissenting) (discussing Smith v. Tiffany).</w:t>
       </w:r>
       <w:r>
         <w:t xml:space="preserve"> </w:t>
@@ -7058,7 +7058,7 @@
         <w:t xml:space="preserve"> </w:t>
       </w:r>
       <w:r>
-        <w:t xml:space="preserve">Co. v. S.C. Second Injury Fund, 389 S.C. 422, 429, 699 S.E.2d 687, 690 (2010) (noting that “[t]he text of a statute is . . . the best evidence of the legislative intent or will”).</w:t>
+        <w:t xml:space="preserve">Co. v. S.C. Second Injury Fund, 389 S.C. 422, 429, 699 S.E.2d 687, 690 (2010) (noting that “[t]he text of a statute is . . . the best evidence of the legislative intent or will”).</w:t>
       </w:r>
     </w:p>
     <w:p>
@@ -7066,13 +7066,13 @@
         <w:pStyle w:val="BodyText"/>
       </w:pPr>
       <w:r>
-        <w:t xml:space="preserve">The Governor and Attorney General ignore these rules, relying instead on a freewheeling extratextual search for their preferred policy outcome. The Attorney General, for his part, says he agrees with Petitioner that the Act is unambiguous, see Att. Gen. Br. at 17 (“no genuine ambiguity exists”), but then searches for the plain meaning of the text through “popular press accounts . . . of the 2023 Act” and evidence that “the General Assembly understood fetal heartbeat to refer to embryonic cardiac activity,” id. at 12–15. The Governor takes a bolder tack, choosing to openly reject this Court’s precedent and argue that textual ambiguity plays no role in statutory analysis. Gov. Br. at 8 n.2 (“The ultimate question is what the General Assembly intended . . . Ambiguity is therefore not some special part of the analysis.”). But if the Governor’s argument had even a whisper of life, the Court snuffed it this month. See Eidson</w:t>
-      </w:r>
-      <w:r>
-        <w:t xml:space="preserve"> </w:t>
-      </w:r>
-      <w:r>
-        <w:t xml:space="preserve">v. S.C. Dept. of Ed., S.E.2d , 2024 WL 4141893, at *13 (S.C. Sept. 11, 2024) (“[I]n considering the meaning of a text, a court should not consider materials outside the text unless the text is ambiguous.”).</w:t>
+        <w:t xml:space="preserve">The Governor and Attorney General ignore these rules, relying instead on a freewheeling extratextual search for their preferred policy outcome. The Attorney General, for his part, says he agrees with Petitioner that the Act is unambiguous, see Att. Gen. Br. at 17 (“no genuine ambiguity exists”), but then searches for the plain meaning of the text through “popular press accounts . . . of the 2023 Act” and evidence that “the General Assembly understood fetal heartbeat to refer to embryonic cardiac activity,” id. at 12–15. The Governor takes a bolder tack, choosing to openly reject this Court’s precedent and argue that textual ambiguity plays no role in statutory analysis. Gov. Br. at 8 n.2 (“The ultimate question is what the General Assembly intended . . . Ambiguity is therefore not some special part of the analysis.”). But if the Governor’s argument had even a whisper of life, the Court snuffed it this month. See Eidson</w:t>
+      </w:r>
+      <w:r>
+        <w:t xml:space="preserve"> </w:t>
+      </w:r>
+      <w:r>
+        <w:t xml:space="preserve">v. S.C. Dept. of Ed., S.E.2d , 2024 WL 4141893, at *13 (S.C. Sept. 11, 2024) (“[I]n considering the meaning of a text, a court should not consider materials outside the text unless the text is ambiguous.”).</w:t>
       </w:r>
     </w:p>
     <w:p>
@@ -7358,19 +7358,25 @@
         <w:pStyle w:val="BodyText"/>
       </w:pPr>
       <w:r>
-        <w:t xml:space="preserve">The purpose of the Act is to prevent certain (but not all) abortions. To that end, the Act imposes felony criminal penalties on healthcare providers who “perform or induce” abortions that are prohibited by the Act. See S.C. Code Ann. §§ 44</w:t>
+        <w:t xml:space="preserve">The purpose of the Act is to prevent certain (but not all) abortions. To that end, the Act imposes felony criminal penalties on healthcare providers who “perform or induce” abortions that are prohibited by the Act. See S.C. Code Ann. §§ 44-⁠41-⁠630(B),</w:t>
+      </w:r>
+      <w:r>
+        <w:t xml:space="preserve"> </w:t>
       </w:r>
       <w:r>
         <w:noBreakHyphen/>
       </w:r>
       <w:r>
-        <w:t xml:space="preserve">41</w:t>
+        <w:t xml:space="preserve">640,</w:t>
+      </w:r>
+      <w:r>
+        <w:t xml:space="preserve"> </w:t>
       </w:r>
       <w:r>
         <w:noBreakHyphen/>
       </w:r>
       <w:r>
-        <w:t xml:space="preserve">630(B),</w:t>
+        <w:t xml:space="preserve">650,</w:t>
       </w:r>
       <w:r>
         <w:t xml:space="preserve"> </w:t>
@@ -7379,24 +7385,6 @@
         <w:noBreakHyphen/>
       </w:r>
       <w:r>
-        <w:t xml:space="preserve">640,</w:t>
-      </w:r>
-      <w:r>
-        <w:t xml:space="preserve"> </w:t>
-      </w:r>
-      <w:r>
-        <w:noBreakHyphen/>
-      </w:r>
-      <w:r>
-        <w:t xml:space="preserve">650,</w:t>
-      </w:r>
-      <w:r>
-        <w:t xml:space="preserve"> </w:t>
-      </w:r>
-      <w:r>
-        <w:noBreakHyphen/>
-      </w:r>
-      <w:r>
         <w:t xml:space="preserve">660. To avoid prosecution, healthcare providers—individuals versed in medical terminology—must be able to read and understand the conduct proscribed by the Act.</w:t>
       </w:r>
     </w:p>
@@ -7417,19 +7405,7 @@
         <w:t xml:space="preserve"> </w:t>
       </w:r>
       <w:r>
-        <w:t xml:space="preserve">Within the Act, the term ‘fetal heartbeat’ is defined to mean “cardiac activity, or the steady and repetitive rhythmic contraction of the fetal heart, within the gestational sac.” S.C. Code § 44</w:t>
-      </w:r>
-      <w:r>
-        <w:noBreakHyphen/>
-      </w:r>
-      <w:r>
-        <w:t xml:space="preserve">41</w:t>
-      </w:r>
-      <w:r>
-        <w:noBreakHyphen/>
-      </w:r>
-      <w:r>
-        <w:t xml:space="preserve">610(6).</w:t>
+        <w:t xml:space="preserve">Within the Act, the term ‘fetal heartbeat’ is defined to mean “cardiac activity, or the steady and repetitive rhythmic contraction of the fetal heart, within the gestational sac.” S.C. Code § 44-⁠41-⁠610(6).</w:t>
       </w:r>
       <w:r>
         <w:t xml:space="preserve"> </w:t>
@@ -7443,19 +7419,7 @@
         <w:pStyle w:val="BodyTextNote"/>
       </w:pPr>
       <w:r>
-        <w:t xml:space="preserve">The 2023 Act does not define ‘fetal’ or ‘fetus.’ The 2021 Act—which was struck down in Planned Parenthood I—misdefined the term ‘human fetus’ to mean “an individual organism of the species homo sapiens from fertilization until live birth.” S.C. Code § 44</w:t>
-      </w:r>
-      <w:r>
-        <w:noBreakHyphen/>
-      </w:r>
-      <w:r>
-        <w:t xml:space="preserve">41</w:t>
-      </w:r>
-      <w:r>
-        <w:noBreakHyphen/>
-      </w:r>
-      <w:r>
-        <w:t xml:space="preserve">610</w:t>
+        <w:t xml:space="preserve">The 2023 Act does not define ‘fetal’ or ‘fetus.’ The 2021 Act—which was struck down in Planned Parenthood I—misdefined the term ‘human fetus’ to mean “an individual organism of the species homo sapiens from fertilization until live birth.” S.C. Code § 44-⁠41-⁠610</w:t>
       </w:r>
       <w:r>
         <w:t xml:space="preserve"> </w:t>
@@ -7517,49 +7481,19 @@
         <w:t xml:space="preserve"> </w:t>
       </w:r>
       <w:r>
-        <w:t xml:space="preserve">(last visited Sept. 4, 2024) (emphasis added). Pregnancy is commonly measured from the first day of a woman’s last menstrual period and, indeed, that is the same definition adopted by the ban. See S.C. Code § 44</w:t>
-      </w:r>
-      <w:r>
-        <w:noBreakHyphen/>
-      </w:r>
-      <w:r>
-        <w:t xml:space="preserve">41</w:t>
-      </w:r>
-      <w:r>
-        <w:noBreakHyphen/>
-      </w:r>
-      <w:r>
-        <w:t xml:space="preserve">610(7)</w:t>
-      </w:r>
-      <w:r>
-        <w:t xml:space="preserve"> </w:t>
-      </w:r>
-      <w:r>
-        <w:t xml:space="preserve">(defining “gestational age” based on the first day of a person’s last menstrual period). Conception is equivalent to fertilization of an egg, see S.C. Code Ann. § 44</w:t>
-      </w:r>
-      <w:r>
-        <w:noBreakHyphen/>
-      </w:r>
-      <w:r>
-        <w:t xml:space="preserve">41</w:t>
-      </w:r>
-      <w:r>
-        <w:noBreakHyphen/>
-      </w:r>
-      <w:r>
-        <w:t xml:space="preserve">10(g),</w:t>
-      </w:r>
-      <w:r>
-        <w:t xml:space="preserve"> </w:t>
-      </w:r>
-      <w:r>
-        <w:t xml:space="preserve">and fertilization occurs roughly two weeks after the first day of a person’s last menstrual period, see Pet’r Br. at 6; accord S.C. Code Ann. Regs. § 61</w:t>
-      </w:r>
-      <w:r>
-        <w:noBreakHyphen/>
-      </w:r>
-      <w:r>
-        <w:t xml:space="preserve">12.101(S).</w:t>
+        <w:t xml:space="preserve">(last visited Sept. 4, 2024) (emphasis added). Pregnancy is commonly measured from the first day of a woman’s last menstrual period and, indeed, that is the same definition adopted by the ban. See S.C. Code § 44-⁠41-⁠610(7)</w:t>
+      </w:r>
+      <w:r>
+        <w:t xml:space="preserve"> </w:t>
+      </w:r>
+      <w:r>
+        <w:t xml:space="preserve">(defining “gestational age” based on the first day of a person’s last menstrual period). Conception is equivalent to fertilization of an egg, see S.C. Code Ann. § 44-⁠41-⁠10(g),</w:t>
+      </w:r>
+      <w:r>
+        <w:t xml:space="preserve"> </w:t>
+      </w:r>
+      <w:r>
+        <w:t xml:space="preserve">and fertilization occurs roughly two weeks after the first day of a person’s last menstrual period, see Pet’r Br. at 6; accord S.C. Code Ann. Regs. § 61-⁠12.101(S).</w:t>
       </w:r>
       <w:r>
         <w:t xml:space="preserve"> </w:t>
@@ -7937,19 +7871,7 @@
         <w:pStyle w:val="BodyText"/>
       </w:pPr>
       <w:r>
-        <w:t xml:space="preserve">By arguing that “fetal heartbeat” should be interpreted to include rhythmic electrical impulses in a 6-week-old embryo, the Governor and Attorney General urge the Court to construe the Act—which carries felony criminal penalties, S.C. Code § 44</w:t>
-      </w:r>
-      <w:r>
-        <w:noBreakHyphen/>
-      </w:r>
-      <w:r>
-        <w:t xml:space="preserve">41</w:t>
-      </w:r>
-      <w:r>
-        <w:noBreakHyphen/>
-      </w:r>
-      <w:r>
-        <w:t xml:space="preserve">630(B)—to</w:t>
+        <w:t xml:space="preserve">By arguing that “fetal heartbeat” should be interpreted to include rhythmic electrical impulses in a 6-week-old embryo, the Governor and Attorney General urge the Court to construe the Act—which carries felony criminal penalties, S.C. Code § 44-⁠41-⁠630(B)—⁠to</w:t>
       </w:r>
       <w:r>
         <w:t xml:space="preserve"> </w:t>
@@ -8025,7 +7947,7 @@
         <w:t xml:space="preserve"> </w:t>
       </w:r>
       <w:r>
-        <w:t xml:space="preserve">123 Harv. L. Rev. 542, 542 (2009) (“Textualism’s emphasis on the primacy of the statutory text . . . suggest[s] . . . that laws are legitimately enforced when their subjects have fair notice of them.”). This guarantees the public a fair opportunity to conform their behavior to the law’s requirements. As scholars have long observed, “textualism appeals to the rule-of-law value that citizens ought to be able to read the statute books and know their rights and duties.” William N. Eskridge,</w:t>
+        <w:t xml:space="preserve">123 Harv. L. Rev. 542, 542 (2009) (“Textualism’s emphasis on the primacy of the statutory text . . . suggest[s] . . . that laws are legitimately enforced when their subjects have fair notice of them.”). This guarantees the public a fair opportunity to conform their behavior to the law’s requirements. As scholars have long observed, “textualism appeals to the rule-of-law value that citizens ought to be able to read the statute books and know their rights and duties.” William N. Eskridge,</w:t>
       </w:r>
       <w:r>
         <w:t xml:space="preserve"> </w:t>
@@ -8409,19 +8331,7 @@
         <w:pStyle w:val="BodyText"/>
       </w:pPr>
       <w:r>
-        <w:t xml:space="preserve">In sum: If the General Assembly wanted to enact a “6-week ban,” then they should’ve done so. Options for doing so abound. The legislature could have tethered the Act’s general prohibitions to a specific number of weeks, as they chose to do elsewhere in the Act. See S.C. Code § 44</w:t>
-      </w:r>
-      <w:r>
-        <w:noBreakHyphen/>
-      </w:r>
-      <w:r>
-        <w:t xml:space="preserve">41</w:t>
-      </w:r>
-      <w:r>
-        <w:noBreakHyphen/>
-      </w:r>
-      <w:r>
-        <w:t xml:space="preserve">650(A).</w:t>
+        <w:t xml:space="preserve">In sum: If the General Assembly wanted to enact a “6-week ban,” then they should’ve done so. Options for doing so abound. The legislature could have tethered the Act’s general prohibitions to a specific number of weeks, as they chose to do elsewhere in the Act. See S.C. Code § 44-⁠41-⁠650(A).</w:t>
       </w:r>
       <w:r>
         <w:t xml:space="preserve"> </w:t>
@@ -8432,7 +8342,7 @@
     </w:p>
     <w:p>
       <w:pPr>
-        <w:pStyle w:val="BodyText"/>
+        <w:pStyle w:val="BodyTextKeep"/>
       </w:pPr>
       <w:r>
         <w:t xml:space="preserve">Amici encourage the Court to reject Respondents’ invitation to adopt new methods of statutory interpretation, give no weight to Planned Parenthood’s arguments in prior cases, and apply the plain meaning of the Act.</w:t>
@@ -8440,6 +8350,8 @@
     </w:p>
     <w:p>
       <w:pPr>
+        <w:keepNext/>
+        <w:keepLines/>
         <w:spacing w:before="0" w:after="0" w:line="576" w:lineRule="exact"/>
       </w:pPr>
     </w:p>
@@ -8752,37 +8664,13 @@
         <w:t xml:space="preserve"> </w:t>
       </w:r>
       <w:r>
-        <w:t xml:space="preserve">Unlike its general prohibition on abortion, the 2023 Act’s exceptions are keyed to gestational age, expressed in weeks. See S.C. Code Ann. § 44</w:t>
-      </w:r>
-      <w:r>
-        <w:noBreakHyphen/>
-      </w:r>
-      <w:r>
-        <w:t xml:space="preserve">41</w:t>
-      </w:r>
-      <w:r>
-        <w:noBreakHyphen/>
-      </w:r>
-      <w:r>
-        <w:t xml:space="preserve">650(A)</w:t>
-      </w:r>
-      <w:r>
-        <w:t xml:space="preserve"> </w:t>
-      </w:r>
-      <w:r>
-        <w:t xml:space="preserve">(permitting abortions resulting from rape and incest so long as the “probable gestational age” is “not more than twelve weeks”); see also S.C. Code Ann. § 44</w:t>
-      </w:r>
-      <w:r>
-        <w:noBreakHyphen/>
-      </w:r>
-      <w:r>
-        <w:t xml:space="preserve">41</w:t>
-      </w:r>
-      <w:r>
-        <w:noBreakHyphen/>
-      </w:r>
-      <w:r>
-        <w:t xml:space="preserve">610(7)</w:t>
+        <w:t xml:space="preserve">Unlike its general prohibition on abortion, the 2023 Act’s exceptions are keyed to gestational age, expressed in weeks. See S.C. Code Ann. § 44-⁠41-⁠650(A)</w:t>
+      </w:r>
+      <w:r>
+        <w:t xml:space="preserve"> </w:t>
+      </w:r>
+      <w:r>
+        <w:t xml:space="preserve">(permitting abortions resulting from rape and incest so long as the “probable gestational age” is “not more than twelve weeks”); see also S.C. Code Ann. § 44-⁠41-⁠610(7)</w:t>
       </w:r>
       <w:r>
         <w:t xml:space="preserve"> </w:t>
@@ -8838,7 +8726,7 @@
         <w:t xml:space="preserve"> </w:t>
       </w:r>
       <w:r>
-        <w:t xml:space="preserve">NIH National Cancer Institute (available at: https://www.cancer.gov/​publications/​dictionaries/​cancer-terms/​def/​fetus) (defining fetus as “[a]n unborn offspring that develops and grows inside the uterus (womb) of humans and other mammals. In humans, the fetal period begins at 9 weeks after fertilization [i.e., 11 weeks LMP] of an egg by a sperm and ends at the time of birth.” (emphasis added)); Fetus, Black’s</w:t>
+        <w:t xml:space="preserve">NIH National Cancer Institute (available at: https://​www.​cancer.​gov/​publications/​dictionaries/​cancer-​terms/​def/​fetus) (defining fetus as “[a]n unborn offspring that develops and grows inside the uterus (womb) of humans and other mammals. In humans, the fetal period begins at 9 weeks after fertilization [i.e., 11 weeks LMP] of an egg by a sperm and ends at the time of birth.” (emphasis added)); Fetus, Black’s</w:t>
       </w:r>
       <w:r>
         <w:t xml:space="preserve"> </w:t>
@@ -8918,7 +8806,7 @@
         <w:t xml:space="preserve"> </w:t>
       </w:r>
       <w:r>
-        <w:t xml:space="preserve">The Antonin Scalia Lecture Series: A Dialogue with Justice Elena Kagan on the Reading of Statutes, YouTube (Nov. 25, 2015) (available at: https://www.youtube.com/​watch?v=dpEtszFT0Tg).</w:t>
+        <w:t xml:space="preserve">The Antonin Scalia Lecture Series: A Dialogue with Justice Elena Kagan on the Reading of Statutes, YouTube (Nov. 25, 2015) (available at: https://​www.​youtube.​com/​watch?​v=dpEtszFT0Tg).</w:t>
       </w:r>
     </w:p>
   </w:footnote>
@@ -9660,6 +9548,7 @@
     <w:unhideWhenUsed/>
     <w:qFormat/>
     <w:pPr>
+      <w:keepLines/>
       <w:spacing w:before="0" w:after="140" w:line="276" w:lineRule="exact"/>
     </w:pPr>
     <w:rPr>
@@ -9858,6 +9747,15 @@
       <w:ind w:firstLine="0"/>
     </w:pPr>
   </w:style>
+  <w:style w:type="paragraph" w:customStyle="1" w:styleId="BodyTextKeep">
+    <w:name w:val="Body Text Keep"/>
+    <w:basedOn w:val="BodyText"/>
+    <w:qFormat/>
+    <w:pPr>
+      <w:keepNext/>
+      <w:keepLines/>
+    </w:pPr>
+  </w:style>
   <w:style w:type="paragraph" w:customStyle="1" w:styleId="XdList1">
     <w:name w:val="XdList 1"/>
     <w:basedOn w:val="Normal"/>
@@ -9910,6 +9808,33 @@
     <w:pPr>
       <w:spacing w:before="0" w:after="0" w:line="276" w:lineRule="exact"/>
       <w:ind w:left="2160" w:hanging="720"/>
+    </w:pPr>
+  </w:style>
+  <w:style w:type="paragraph" w:customStyle="1" w:styleId="XdQuoteList1">
+    <w:name w:val="Xd Quote List 1"/>
+    <w:basedOn w:val="Normal"/>
+    <w:qFormat/>
+    <w:pPr>
+      <w:spacing w:before="0" w:after="0" w:line="276" w:lineRule="exact"/>
+      <w:ind w:left="1440" w:right="720" w:hanging="720"/>
+    </w:pPr>
+  </w:style>
+  <w:style w:type="paragraph" w:customStyle="1" w:styleId="XdQuoteList2">
+    <w:name w:val="Xd Quote List 2"/>
+    <w:basedOn w:val="Normal"/>
+    <w:qFormat/>
+    <w:pPr>
+      <w:spacing w:before="0" w:after="0" w:line="276" w:lineRule="exact"/>
+      <w:ind w:left="2160" w:right="720" w:hanging="720"/>
+    </w:pPr>
+  </w:style>
+  <w:style w:type="paragraph" w:customStyle="1" w:styleId="XdQuoteList3">
+    <w:name w:val="Xd Quote List 3"/>
+    <w:basedOn w:val="Normal"/>
+    <w:qFormat/>
+    <w:pPr>
+      <w:spacing w:before="0" w:after="0" w:line="276" w:lineRule="exact"/>
+      <w:ind w:left="2880" w:right="720" w:hanging="720"/>
     </w:pPr>
   </w:style>
   <w:style w:type="paragraph" w:customStyle="1" w:styleId="SourceCode">

</xml_diff>